<commit_message>
Add missing details from original agent-setup-guide
Added:
- Attribution notes (Gil Tabak, Gil Sheffi, Gal Carmi dates)
- Migration prompt note for existing branches
- Build/deploy skills note
- Coverage check LLM prediction detail
- Daily activation tracker (Maia's sheet)
- UC-12 gotcha and feedback notes
- Cross-references to blockers section
- Additional context notes

Co-authored-by: maiagordon-commits <maiagordon-commits@users.noreply.github.com>
</commit_message>
<xml_diff>
--- a/CURSOR_CLOUD_AGENTS_GUIDE.docx
+++ b/CURSOR_CLOUD_AGENTS_GUIDE.docx
@@ -4971,6 +4971,16 @@
       <w:r>
         <w:t xml:space="preserve">.</w:t>
       </w:r>
+      <w:r>
+        <w:t xml:space="preserve"> </w:t>
+      </w:r>
+      <w:r>
+        <w:rPr>
+          <w:iCs/>
+          <w:i/>
+        </w:rPr>
+        <w:t xml:space="preserve">(Gil Tabak, Jul 15)</w:t>
+      </w:r>
     </w:p>
     <w:p>
       <w:pPr>
@@ -5189,7 +5199,57 @@
         <w:t xml:space="preserve"> </w:t>
       </w:r>
       <w:r>
-        <w:t xml:space="preserve">and still drives everything.</w:t>
+        <w:t xml:space="preserve">and still drives everything — run it there; it puts output in the right place. Same for build/deploy skills.</w:t>
+      </w:r>
+    </w:p>
+    <w:p>
+      <w:pPr>
+        <w:numPr>
+          <w:ilvl w:val="0"/>
+          <w:numId w:val="1029"/>
+        </w:numPr>
+        <w:pStyle w:val="Compact"/>
+      </w:pPr>
+      <w:r>
+        <w:t xml:space="preserve">Have an open branch that still touches</w:t>
+      </w:r>
+      <w:r>
+        <w:t xml:space="preserve"> </w:t>
+      </w:r>
+      <w:r>
+        <w:rPr>
+          <w:rStyle w:val="VerbatimChar"/>
+        </w:rPr>
+        <w:t xml:space="preserve">specs/core/use-cases/</w:t>
+      </w:r>
+      <w:r>
+        <w:t xml:space="preserve">? Use</w:t>
+      </w:r>
+      <w:r>
+        <w:t xml:space="preserve"> </w:t>
+      </w:r>
+      <w:r>
+        <w:rPr>
+          <w:bCs/>
+          <w:b/>
+        </w:rPr>
+        <w:t xml:space="preserve">Gil Tabak’s migration prompt</w:t>
+      </w:r>
+      <w:r>
+        <w:t xml:space="preserve"> </w:t>
+      </w:r>
+      <w:r>
+        <w:t xml:space="preserve">(pinned in his message) to move it into the registry automatically.</w:t>
+      </w:r>
+      <w:r>
+        <w:t xml:space="preserve"> </w:t>
+      </w:r>
+      <w:r>
+        <w:rPr>
+          <w:iCs/>
+          <w:i/>
+        </w:rPr>
+        <w:t xml:space="preserve">(We did exactly this for UC-12.)</w:t>
       </w:r>
     </w:p>
     <w:p>
@@ -5227,6 +5287,16 @@
       </w:r>
       <w:r>
         <w:t xml:space="preserve">— it has the most recent planner.</w:t>
+      </w:r>
+      <w:r>
+        <w:t xml:space="preserve"> </w:t>
+      </w:r>
+      <w:r>
+        <w:rPr>
+          <w:iCs/>
+          <w:i/>
+        </w:rPr>
+        <w:t xml:space="preserve">(Gil Sheffi, Jul 13)</w:t>
       </w:r>
     </w:p>
     <w:p>
@@ -5649,7 +5719,7 @@
               <w:jc w:val="left"/>
             </w:pPr>
             <w:r>
-              <w:t xml:space="preserve">Covers CodeArtifact (uv), Bedrock, Vault-creds read</w:t>
+              <w:t xml:space="preserve">Covers CodeArtifact (uv), Bedrock, Vault-creds read. The single staging credential.</w:t>
             </w:r>
           </w:p>
         </w:tc>
@@ -5763,7 +5833,7 @@
               <w:t xml:space="preserve"> </w:t>
             </w:r>
             <w:r>
-              <w:t xml:space="preserve">access</w:t>
+              <w:t xml:space="preserve">access — see §A9 Blockers</w:t>
             </w:r>
           </w:p>
         </w:tc>
@@ -5934,7 +6004,7 @@
         <w:t xml:space="preserve">python scripts/local/authn.py</w:t>
       </w:r>
       <w:r>
-        <w:t xml:space="preserve">), TTL &gt; 60s.</w:t>
+        <w:t xml:space="preserve">), TTL &gt; 60s. Token must have at least 60 seconds remaining.</w:t>
       </w:r>
     </w:p>
     <w:p>
@@ -6265,7 +6335,7 @@
           <w:bCs/>
           <w:b/>
         </w:rPr>
-        <w:t xml:space="preserve">Gil’s rule:</w:t>
+        <w:t xml:space="preserve">Gil’s siren (Jul 16):</w:t>
       </w:r>
       <w:r>
         <w:t xml:space="preserve"> </w:t>
@@ -6996,7 +7066,7 @@
           <w:bCs/>
           <w:b/>
         </w:rPr>
-        <w:t xml:space="preserve">Gotcha:</w:t>
+        <w:t xml:space="preserve">Gotcha (UC-12):</w:t>
       </w:r>
       <w:r>
         <w:t xml:space="preserve"> </w:t>
@@ -7068,7 +7138,7 @@
         <w:t xml:space="preserve">listingLinks</w:t>
       </w:r>
       <w:r>
-        <w:t xml:space="preserve">) in state and point the declaration at that.</w:t>
+        <w:t xml:space="preserve">) in state and point the declaration at that. The coverage check is an LLM that predicts entity types from the WORKFLOW_OUTPUT prompt; every predicted type must have a declaration, so don’t enumerate un-linkable entity types (fees, channels) in a way that makes it predict them.</w:t>
       </w:r>
     </w:p>
     <w:p>
@@ -7539,6 +7609,16 @@
         </w:rPr>
         <w:t xml:space="preserve">Not CI-blocking by design, but get all checks green.</w:t>
       </w:r>
+      <w:r>
+        <w:t xml:space="preserve"> </w:t>
+      </w:r>
+      <w:r>
+        <w:rPr>
+          <w:iCs/>
+          <w:i/>
+        </w:rPr>
+        <w:t xml:space="preserve">(Gal Carmi, Jul 14)</w:t>
+      </w:r>
     </w:p>
     <w:p>
       <w:pPr>
@@ -7590,6 +7670,16 @@
         </w:rPr>
         <w:t xml:space="preserve">”</w:t>
       </w:r>
+      <w:r>
+        <w:t xml:space="preserve"> </w:t>
+      </w:r>
+      <w:r>
+        <w:rPr>
+          <w:iCs/>
+          <w:i/>
+        </w:rPr>
+        <w:t xml:space="preserve">(Gal Carmi — this unblocked Rinat.)</w:t>
+      </w:r>
     </w:p>
     <w:p>
       <w:pPr>
@@ -7600,7 +7690,7 @@
         <w:pStyle w:val="Compact"/>
       </w:pPr>
       <w:r>
-        <w:t xml:space="preserve">Needs the api-sdk MCP index → see §A8 if it 404s.</w:t>
+        <w:t xml:space="preserve">Needs the api-sdk MCP index → see §A9 if it 404s.</w:t>
       </w:r>
     </w:p>
     <w:p>
@@ -7800,7 +7890,22 @@
         <w:t xml:space="preserve">workflow_logic_cases</w:t>
       </w:r>
       <w:r>
-        <w:t xml:space="preserve">.</w:t>
+        <w:t xml:space="preserve"> </w:t>
+      </w:r>
+      <w:r>
+        <w:t xml:space="preserve">(replaces old</w:t>
+      </w:r>
+      <w:r>
+        <w:t xml:space="preserve"> </w:t>
+      </w:r>
+      <w:r>
+        <w:rPr>
+          <w:rStyle w:val="VerbatimChar"/>
+        </w:rPr>
+        <w:t xml:space="preserve">test_uc*.py</w:t>
+      </w:r>
+      <w:r>
+        <w:t xml:space="preserve">).</w:t>
       </w:r>
     </w:p>
     <w:p>
@@ -7942,6 +8047,16 @@
           <w:b/>
         </w:rPr>
         <w:t xml:space="preserve">is not really supported and still shows in the UI.</w:t>
+      </w:r>
+      <w:r>
+        <w:t xml:space="preserve"> </w:t>
+      </w:r>
+      <w:r>
+        <w:rPr>
+          <w:iCs/>
+          <w:i/>
+        </w:rPr>
+        <w:t xml:space="preserve">(Gil, Jul 6)</w:t>
       </w:r>
     </w:p>
     <w:p>
@@ -8137,7 +8252,49 @@
               <w:t xml:space="preserve">@guestyci</w:t>
             </w:r>
             <w:r>
-              <w:t xml:space="preserve">.</w:t>
+              <w:t xml:space="preserve">. Without it,</w:t>
+            </w:r>
+            <w:r>
+              <w:t xml:space="preserve"> </w:t>
+            </w:r>
+            <w:r>
+              <w:rPr>
+                <w:rStyle w:val="VerbatimChar"/>
+              </w:rPr>
+              <w:t xml:space="preserve">resource_links_declared</w:t>
+            </w:r>
+            <w:r>
+              <w:t xml:space="preserve"> </w:t>
+            </w:r>
+            <w:r>
+              <w:t xml:space="preserve">+</w:t>
+            </w:r>
+            <w:r>
+              <w:t xml:space="preserve"> </w:t>
+            </w:r>
+            <w:r>
+              <w:rPr>
+                <w:rStyle w:val="VerbatimChar"/>
+              </w:rPr>
+              <w:t xml:space="preserve">resource_links_coverage</w:t>
+            </w:r>
+            <w:r>
+              <w:t xml:space="preserve"> </w:t>
+            </w:r>
+            <w:r>
+              <w:t xml:space="preserve">can still be run directly (declared is structural; coverage only needs Bedrock via</w:t>
+            </w:r>
+            <w:r>
+              <w:t xml:space="preserve"> </w:t>
+            </w:r>
+            <w:r>
+              <w:rPr>
+                <w:rStyle w:val="VerbatimChar"/>
+              </w:rPr>
+              <w:t xml:space="preserve">pm</w:t>
+            </w:r>
+            <w:r>
+              <w:t xml:space="preserve">).</w:t>
             </w:r>
           </w:p>
         </w:tc>
@@ -8224,7 +8381,7 @@
               <w:t xml:space="preserve"> </w:t>
             </w:r>
             <w:r>
-              <w:t xml:space="preserve">returns</w:t>
+              <w:t xml:space="preserve">(the OAuth client) returns</w:t>
             </w:r>
             <w:r>
               <w:t xml:space="preserve"> </w:t>
@@ -8237,7 +8394,7 @@
               <w:t xml:space="preserve">no data</w:t>
             </w:r>
             <w:r>
-              <w:t xml:space="preserve">. Needs the</w:t>
+              <w:t xml:space="preserve">, so the executor can’t bootstrap. Needs the</w:t>
             </w:r>
             <w:r>
               <w:t xml:space="preserve"> </w:t>
@@ -8253,7 +8410,7 @@
               <w:t xml:space="preserve"> </w:t>
             </w:r>
             <w:r>
-              <w:t xml:space="preserve">to populate/repoint that secret.</w:t>
+              <w:t xml:space="preserve">to populate/repoint that secret. (Affects local live runs on staging.)</w:t>
             </w:r>
           </w:p>
         </w:tc>
@@ -8749,19 +8906,7 @@
         <w:t xml:space="preserve"> </w:t>
       </w:r>
       <w:r>
-        <w:t xml:space="preserve">(no essays). Use shipped UCs 1–11 as reference.</w:t>
-      </w:r>
-    </w:p>
-    <w:p>
-      <w:pPr>
-        <w:numPr>
-          <w:ilvl w:val="0"/>
-          <w:numId w:val="1037"/>
-        </w:numPr>
-        <w:pStyle w:val="Compact"/>
-      </w:pPr>
-      <w:r>
-        <w:t xml:space="preserve">Validate the</w:t>
+        <w:t xml:space="preserve">(no essays). Use shipped UCs 1–11 as reference. Also validate the</w:t>
       </w:r>
       <w:r>
         <w:t xml:space="preserve"> </w:t>
@@ -8779,6 +8924,51 @@
       <w:r>
         <w:t xml:space="preserve">when the agent is selected.</w:t>
       </w:r>
+      <w:r>
+        <w:t xml:space="preserve"> </w:t>
+      </w:r>
+      <w:r>
+        <w:rPr>
+          <w:iCs/>
+          <w:i/>
+        </w:rPr>
+        <w:t xml:space="preserve">(Gil, repeatedly — he threatened to turn off agents with</w:t>
+      </w:r>
+      <w:r>
+        <w:rPr>
+          <w:iCs/>
+          <w:i/>
+        </w:rPr>
+        <w:t xml:space="preserve"> </w:t>
+      </w:r>
+      <w:r>
+        <w:rPr>
+          <w:iCs/>
+          <w:i/>
+        </w:rPr>
+        <w:t xml:space="preserve">“</w:t>
+      </w:r>
+      <w:r>
+        <w:rPr>
+          <w:iCs/>
+          <w:i/>
+        </w:rPr>
+        <w:t xml:space="preserve">embarrassing text</w:t>
+      </w:r>
+      <w:r>
+        <w:rPr>
+          <w:iCs/>
+          <w:i/>
+        </w:rPr>
+        <w:t xml:space="preserve">”</w:t>
+      </w:r>
+      <w:r>
+        <w:rPr>
+          <w:iCs/>
+          <w:i/>
+        </w:rPr>
+        <w:t xml:space="preserve">.)</w:t>
+      </w:r>
     </w:p>
     <w:p>
       <w:pPr>
@@ -8823,7 +9013,7 @@
         <w:t xml:space="preserve"> </w:t>
       </w:r>
       <w:r>
-        <w:t xml:space="preserve">Google doc) for descriptions, titles, marketing video copy.</w:t>
+        <w:t xml:space="preserve">Google doc) for descriptions, titles, marketing video copy — fill these early to avoid PMM↔UX back-and-forth.</w:t>
       </w:r>
     </w:p>
     <w:p>
@@ -8858,6 +9048,16 @@
       </w:r>
       <w:r>
         <w:t xml:space="preserve">”</w:t>
+      </w:r>
+      <w:r>
+        <w:t xml:space="preserve"> </w:t>
+      </w:r>
+      <w:r>
+        <w:rPr>
+          <w:iCs/>
+          <w:i/>
+        </w:rPr>
+        <w:t xml:space="preserve">(Gil, Jul 22)</w:t>
       </w:r>
     </w:p>
     <w:p>
@@ -8981,6 +9181,28 @@
       </w:r>
       <w:r>
         <w:t xml:space="preserve">).</w:t>
+      </w:r>
+    </w:p>
+    <w:p>
+      <w:pPr>
+        <w:numPr>
+          <w:ilvl w:val="0"/>
+          <w:numId w:val="1038"/>
+        </w:numPr>
+        <w:pStyle w:val="Compact"/>
+      </w:pPr>
+      <w:r>
+        <w:rPr>
+          <w:bCs/>
+          <w:b/>
+        </w:rPr>
+        <w:t xml:space="preserve">Daily activation tracker</w:t>
+      </w:r>
+      <w:r>
+        <w:t xml:space="preserve"> </w:t>
+      </w:r>
+      <w:r>
+        <w:t xml:space="preserve">(Maia’s sheet) shows per-agent activation; use live accounts’ outputs to improve prompts.</w:t>
       </w:r>
     </w:p>
     <w:p>
@@ -9377,7 +9599,7 @@
         <w:t xml:space="preserve"> </w:t>
       </w:r>
       <w:r>
-        <w:t xml:space="preserve">entities where relevant — filter out inactive/unlisted.</w:t>
+        <w:t xml:space="preserve">entities where relevant — filter out inactive/unlisted (review feedback we got on UC-12).</w:t>
       </w:r>
     </w:p>
     <w:p>

</xml_diff>